<commit_message>
Export accepted suggestions as WPS revisions
</commit_message>
<xml_diff>
--- a/public/demo/island-whitenoise-annotated.docx
+++ b/public/demo/island-whitenoise-annotated.docx
@@ -15,7 +15,7 @@
           <w:sz w:val="44"/>
           <w:szCs w:val="44"/>
         </w:rPr>
-        <w:t xml:space="preserve">Max Mara SS26 · 岛屿白噪音 · 达人脚本审核批注稿</w:t>
+        <w:t xml:space="preserve">Max Mara SS26 · 岛屿白噪音 · 达人脚本审核修订稿</w:t>
       </w:r>
     </w:p>
     <w:p>
@@ -38,213 +38,348 @@
       <w:r>
         <w:rPr>
           <w:rFonts w:ascii="Arial Unicode MS" w:cs="Arial Unicode MS" w:eastAsia="Arial Unicode MS" w:hAnsi="Arial Unicode MS"/>
-          <w:color w:val="C00000"/>
-          <w:sz w:val="22"/>
-          <w:szCs w:val="22"/>
-          <w:highlight w:val="yellow"/>
-          <w:highlightCs w:val="yellow"/>
+          <w:sz w:val="22"/>
+          <w:szCs w:val="22"/>
         </w:rPr>
         <w:t xml:space="preserve">内容方向：Max Mara SS26 秀场深度解析（浅带过秀场-实穿）-视频脚本</w:t>
       </w:r>
+    </w:p>
+    <w:p>
+      <w:pPr>
+        <w:spacing w:after="120" w:line="300"/>
+      </w:pPr>
+      <w:r>
+        <w:rPr>
+          <w:rFonts w:ascii="Arial Unicode MS" w:cs="Arial Unicode MS" w:eastAsia="Arial Unicode MS" w:hAnsi="Arial Unicode MS"/>
+          <w:sz w:val="22"/>
+          <w:szCs w:val="22"/>
+        </w:rPr>
+        <w:t xml:space="preserve">时长：3min 以内</w:t>
+      </w:r>
+    </w:p>
+    <w:p>
+      <w:pPr>
+        <w:spacing w:after="120" w:line="300"/>
+      </w:pPr>
+      <w:r>
+        <w:rPr>
+          <w:rFonts w:ascii="Arial Unicode MS" w:cs="Arial Unicode MS" w:eastAsia="Arial Unicode MS" w:hAnsi="Arial Unicode MS"/>
+          <w:sz w:val="22"/>
+          <w:szCs w:val="22"/>
+        </w:rPr>
+        <w:t xml:space="preserve">合作档期：3/17</w:t>
+      </w:r>
+    </w:p>
+    <w:p>
+      <w:pPr>
+        <w:spacing w:after="120" w:line="300"/>
+      </w:pPr>
+      <w:r>
+        <w:rPr>
+          <w:rFonts w:ascii="Arial Unicode MS" w:cs="Arial Unicode MS" w:eastAsia="Arial Unicode MS" w:hAnsi="Arial Unicode MS"/>
+          <w:sz w:val="22"/>
+          <w:szCs w:val="22"/>
+        </w:rPr>
+        <w:t xml:space="preserve">标题（二选一）</w:t>
+      </w:r>
+    </w:p>
+    <w:p>
+      <w:pPr>
+        <w:spacing w:after="120" w:line="300"/>
+      </w:pPr>
+      <w:r>
+        <w:rPr>
+          <w:rFonts w:ascii="Arial Unicode MS" w:cs="Arial Unicode MS" w:eastAsia="Arial Unicode MS" w:hAnsi="Arial Unicode MS"/>
+          <w:sz w:val="22"/>
+          <w:szCs w:val="22"/>
+        </w:rPr>
+        <w:t xml:space="preserve">1. 18 世纪的浪漫，如何穿成当代通勤的锋利气场？</w:t>
+      </w:r>
+    </w:p>
+    <w:p>
+      <w:pPr>
+        <w:spacing w:after="120" w:line="300"/>
+      </w:pPr>
+      <w:r>
+        <w:rPr>
+          <w:rFonts w:ascii="Arial Unicode MS" w:cs="Arial Unicode MS" w:eastAsia="Arial Unicode MS" w:hAnsi="Arial Unicode MS"/>
+          <w:sz w:val="22"/>
+          <w:szCs w:val="22"/>
+        </w:rPr>
+        <w:t xml:space="preserve">2. Rococo Modern｜把繁复宫廷穿成当代锋芒</w:t>
+      </w:r>
+    </w:p>
+    <w:p>
+      <w:pPr>
+        <w:spacing w:after="120" w:line="300"/>
+      </w:pPr>
+      <w:commentRangeStart w:id="2"/>
+      <w:del w:id="4" w:author="仟传小省力" w:date="2026-07-28T17:00:31.504Z">
+        <w:r>
+          <w:rPr>
+            <w:rFonts w:ascii="Arial Unicode MS" w:cs="Arial Unicode MS" w:eastAsia="Arial Unicode MS" w:hAnsi="Arial Unicode MS"/>
+            <w:strike/>
+            <w:color w:val="C00000"/>
+            <w:sz w:val="22"/>
+            <w:szCs w:val="22"/>
+          </w:rPr>
+          <w:delText xml:space="preserve">洛可可风起源于 18 世纪的法国</w:delText>
+        </w:r>
+      </w:del>
+      <w:ins w:id="5" w:author="仟传小省力" w:date="2026-07-28T17:00:31.505Z">
+        <w:r>
+          <w:rPr>
+            <w:rFonts w:ascii="Arial Unicode MS" w:cs="Arial Unicode MS" w:eastAsia="Arial Unicode MS" w:hAnsi="Arial Unicode MS"/>
+            <w:color w:val="1F4E78"/>
+            <w:sz w:val="22"/>
+            <w:szCs w:val="22"/>
+          </w:rPr>
+          <w:t xml:space="preserve">先用 18 世纪宫廷繁复与当代职场的反差提问，再进入历史背景</w:t>
+        </w:r>
+      </w:ins>
+      <w:commentRangeEnd w:id="2"/>
+      <w:commentReference w:id="2"/>
+      <w:r>
+        <w:rPr>
+          <w:rFonts w:ascii="Arial Unicode MS" w:cs="Arial Unicode MS" w:eastAsia="Arial Unicode MS" w:hAnsi="Arial Unicode MS"/>
+          <w:sz w:val="22"/>
+          <w:szCs w:val="22"/>
+        </w:rPr>
+        <w:t xml:space="preserve">，强调夸张的造型、繁复的装饰，马卡龙色彩以及自然形态的装饰。如果说这一时期的洛可可代表着繁复与奢靡，那 Max Mara 2026 春夏系列就是对它</w:t>
+      </w:r>
+      <w:commentRangeStart w:id="0"/>
+      <w:del w:id="0" w:author="仟传小省力" w:date="2026-07-28T17:00:31.505Z">
+        <w:r>
+          <w:rPr>
+            <w:rFonts w:ascii="Arial Unicode MS" w:cs="Arial Unicode MS" w:eastAsia="Arial Unicode MS" w:hAnsi="Arial Unicode MS"/>
+            <w:strike/>
+            <w:color w:val="C00000"/>
+            <w:sz w:val="22"/>
+            <w:szCs w:val="22"/>
+          </w:rPr>
+          <w:delText xml:space="preserve">最彻底最鲜活的当代反叛</w:delText>
+        </w:r>
+      </w:del>
+      <w:ins w:id="1" w:author="仟传小省力" w:date="2026-07-28T17:00:31.505Z">
+        <w:r>
+          <w:rPr>
+            <w:rFonts w:ascii="Arial Unicode MS" w:cs="Arial Unicode MS" w:eastAsia="Arial Unicode MS" w:hAnsi="Arial Unicode MS"/>
+            <w:color w:val="1F4E78"/>
+            <w:sz w:val="22"/>
+            <w:szCs w:val="22"/>
+          </w:rPr>
+          <w:t xml:space="preserve">一次彻底且鲜活的当代反叛</w:t>
+        </w:r>
+      </w:ins>
+      <w:commentRangeEnd w:id="0"/>
+      <w:commentReference w:id="0"/>
+      <w:r>
+        <w:rPr>
+          <w:rFonts w:ascii="Arial Unicode MS" w:cs="Arial Unicode MS" w:eastAsia="Arial Unicode MS" w:hAnsi="Arial Unicode MS"/>
+          <w:sz w:val="22"/>
+          <w:szCs w:val="22"/>
+        </w:rPr>
+        <w:t xml:space="preserve">——在米兰秀场上，Max Mara 以「洛可可新风（Rococo Modern）」为核，将洛可可的繁复奢靡拆解重构，让简约灵动成为优雅新解，在理性与幻想的交织里，暗涌着秩序中的叛逆。</w:t>
+      </w:r>
+    </w:p>
+    <w:p>
+      <w:pPr>
+        <w:spacing w:after="120" w:line="300"/>
+      </w:pPr>
+      <w:r>
+        <w:rPr>
+          <w:rFonts w:ascii="Arial Unicode MS" w:cs="Arial Unicode MS" w:eastAsia="Arial Unicode MS" w:hAnsi="Arial Unicode MS"/>
+          <w:sz w:val="22"/>
+          <w:szCs w:val="22"/>
+        </w:rPr>
+        <w:t xml:space="preserve">这季设计的巧思，藏在“洛可可元素的当代化表达”里！作为洛可可风格的标志性符号，褶皱与涡卷纹样被剥离了宫廷的甜腻感：品牌标志性的利落风衣在肩部绽开繁复褶叠花冠，修身铅笔裙侧腰浮起丰盈褶皱，全黑羽翼外套则用线条的张力，替代了传统洛可可的柔媚装饰。</w:t>
+      </w:r>
+    </w:p>
+    <w:p>
+      <w:pPr>
+        <w:spacing w:after="120" w:line="300"/>
+      </w:pPr>
+      <w:commentRangeStart w:id="4"/>
+      <w:del w:id="8" w:author="仟传小省力" w:date="2026-07-28T17:00:31.505Z">
+        <w:r>
+          <w:rPr>
+            <w:rFonts w:ascii="Arial Unicode MS" w:cs="Arial Unicode MS" w:eastAsia="Arial Unicode MS" w:hAnsi="Arial Unicode MS"/>
+            <w:strike/>
+            <w:color w:val="C00000"/>
+            <w:sz w:val="22"/>
+            <w:szCs w:val="22"/>
+          </w:rPr>
+          <w:delText xml:space="preserve">而精裁西装、低腰长裤的利落廓形</w:delText>
+        </w:r>
+      </w:del>
+      <w:ins w:id="9" w:author="仟传小省力" w:date="2026-07-28T17:00:31.505Z">
+        <w:r>
+          <w:rPr>
+            <w:rFonts w:ascii="Arial Unicode MS" w:cs="Arial Unicode MS" w:eastAsia="Arial Unicode MS" w:hAnsi="Arial Unicode MS"/>
+            <w:color w:val="1F4E78"/>
+            <w:sz w:val="22"/>
+            <w:szCs w:val="22"/>
+          </w:rPr>
+          <w:t xml:space="preserve">经得起时间考验的投资性单品</w:t>
+        </w:r>
+      </w:ins>
+      <w:commentRangeEnd w:id="4"/>
+      <w:commentReference w:id="4"/>
+      <w:r>
+        <w:rPr>
+          <w:rFonts w:ascii="Arial Unicode MS" w:cs="Arial Unicode MS" w:eastAsia="Arial Unicode MS" w:hAnsi="Arial Unicode MS"/>
+          <w:sz w:val="22"/>
+          <w:szCs w:val="22"/>
+        </w:rPr>
+        <w:t xml:space="preserve">，又将 18 世纪的洛可可美学，稳稳收进当代职场女性的气场里。</w:t>
+      </w:r>
+    </w:p>
+    <w:p>
+      <w:pPr>
+        <w:spacing w:after="120" w:line="300"/>
+      </w:pPr>
+      <w:r>
+        <w:rPr>
+          <w:rFonts w:ascii="Arial Unicode MS" w:cs="Arial Unicode MS" w:eastAsia="Arial Unicode MS" w:hAnsi="Arial Unicode MS"/>
+          <w:sz w:val="22"/>
+          <w:szCs w:val="22"/>
+        </w:rPr>
+        <w:t xml:space="preserve">就像这件浅卡其收腰西装，利落斜襟自带力量感，侧扣撞色袖口点亮细节——通勤、商务场景皆能驾驭，既保留 Max Mara 标志性的女绅士风骨，又藏着极简主义的精致；还有这件花瓣肩西装，肩部褶皱如盛放花冠，直身版型平衡柔媚与干练，周末 brunch 或城市漫步时穿，刚好是“温柔里藏锋芒”的高级感；或是这套短款西装 + 半裙，利落短款拉长身材比例，收腰设计强化干练气场，小个子也能穿出独属于自己的</w:t>
+      </w:r>
+      <w:commentRangeStart w:id="3"/>
+      <w:del w:id="6" w:author="仟传小省力" w:date="2026-07-28T17:00:31.505Z">
+        <w:r>
+          <w:rPr>
+            <w:rFonts w:ascii="Arial Unicode MS" w:cs="Arial Unicode MS" w:eastAsia="Arial Unicode MS" w:hAnsi="Arial Unicode MS"/>
+            <w:strike/>
+            <w:color w:val="C00000"/>
+            <w:sz w:val="22"/>
+            <w:szCs w:val="22"/>
+          </w:rPr>
+          <w:delText xml:space="preserve">大女主姿态</w:delText>
+        </w:r>
+      </w:del>
+      <w:ins w:id="7" w:author="仟传小省力" w:date="2026-07-28T17:00:31.505Z">
+        <w:r>
+          <w:rPr>
+            <w:rFonts w:ascii="Arial Unicode MS" w:cs="Arial Unicode MS" w:eastAsia="Arial Unicode MS" w:hAnsi="Arial Unicode MS"/>
+            <w:color w:val="1F4E78"/>
+            <w:sz w:val="22"/>
+            <w:szCs w:val="22"/>
+          </w:rPr>
+          <w:t xml:space="preserve">属于自己的从容气场</w:t>
+        </w:r>
+      </w:ins>
+      <w:commentRangeEnd w:id="3"/>
+      <w:commentReference w:id="3"/>
+      <w:r>
+        <w:rPr>
+          <w:rFonts w:ascii="Arial Unicode MS" w:cs="Arial Unicode MS" w:eastAsia="Arial Unicode MS" w:hAnsi="Arial Unicode MS"/>
+          <w:sz w:val="22"/>
+          <w:szCs w:val="22"/>
+        </w:rPr>
+        <w:t xml:space="preserve">！</w:t>
+      </w:r>
+    </w:p>
+    <w:p>
+      <w:pPr>
+        <w:spacing w:after="120" w:line="300"/>
+      </w:pPr>
+      <w:r>
+        <w:rPr>
+          <w:rFonts w:ascii="Arial Unicode MS" w:cs="Arial Unicode MS" w:eastAsia="Arial Unicode MS" w:hAnsi="Arial Unicode MS"/>
+          <w:sz w:val="22"/>
+          <w:szCs w:val="22"/>
+        </w:rPr>
+        <w:t xml:space="preserve">色彩的转译，更是 Max Mara 对洛可可美学的全新诠释：传统洛可可偏爱浓艳金红的奢靡视觉，而本季雾粉、银灰、浅金等通透色调成为主角，如春日清风般轻盈透气，却依旧饱含情绪张力——这正是洛可可美学的核心奥义：美不必沉重，但必须深刻。</w:t>
+      </w:r>
+    </w:p>
+    <w:p>
+      <w:pPr>
+        <w:spacing w:after="120" w:line="300"/>
+      </w:pPr>
+      <w:r>
+        <w:rPr>
+          <w:rFonts w:ascii="Arial Unicode MS" w:cs="Arial Unicode MS" w:eastAsia="Arial Unicode MS" w:hAnsi="Arial Unicode MS"/>
+          <w:sz w:val="22"/>
+          <w:szCs w:val="22"/>
+        </w:rPr>
+        <w:t xml:space="preserve">而这一切设计的灵感源头，正是 18 世纪法国宫廷的传奇女性蓬帕杜夫人。她并非只是宫廷贵妇人，更是凭才华与智慧打破性别桎梏的先锋：以审美定义时代风格，用果敢搅动宫廷格局，将“自我表达”刻进了洛可可的灵魂。</w:t>
+      </w:r>
+    </w:p>
+    <w:p>
+      <w:pPr>
+        <w:spacing w:after="120" w:line="300"/>
+      </w:pPr>
+      <w:r>
+        <w:rPr>
+          <w:rFonts w:ascii="Arial Unicode MS" w:cs="Arial Unicode MS" w:eastAsia="Arial Unicode MS" w:hAnsi="Arial Unicode MS"/>
+          <w:sz w:val="22"/>
+          <w:szCs w:val="22"/>
+        </w:rPr>
+        <w:t xml:space="preserve">Max Mara 2026 春夏系列，正是对她这份精神的当代致敬：黑色弹力腰带收束繁复褶皱，束带式肩带简化宫廷线条，把洛可可的繁复精致作为华丽底色，用利落的设计细节诠释机动简洁的锋利态度，恰如蓬帕杜夫人凭才华站上时代中心的果敢锋芒。</w:t>
+      </w:r>
+    </w:p>
+    <w:p>
+      <w:pPr>
+        <w:spacing w:after="120" w:line="300"/>
+      </w:pPr>
+      <w:r>
+        <w:rPr>
+          <w:rFonts w:ascii="Arial Unicode MS" w:cs="Arial Unicode MS" w:eastAsia="Arial Unicode MS" w:hAnsi="Arial Unicode MS"/>
+          <w:sz w:val="22"/>
+          <w:szCs w:val="22"/>
+        </w:rPr>
+        <w:t xml:space="preserve">作家岳本野蔷薇曾言，洛可可的根基是“究极个人主义”，像朋克摇滚般不讨好、不迎合，只专注自我——这既是 18 世纪洛可可的反叛内核，也是 Max Mara 想带给当代女性的底气：用轻盈色调藏起繁复线条，以精致设计包裹不妥协的态度，让女性在雅致中蕴生力量，</w:t>
+      </w:r>
+      <w:commentRangeStart w:id="5"/>
+      <w:del w:id="10" w:author="仟传小省力" w:date="2026-07-28T17:00:31.505Z">
+        <w:r>
+          <w:rPr>
+            <w:rFonts w:ascii="Arial Unicode MS" w:cs="Arial Unicode MS" w:eastAsia="Arial Unicode MS" w:hAnsi="Arial Unicode MS"/>
+            <w:strike/>
+            <w:color w:val="C00000"/>
+            <w:sz w:val="22"/>
+            <w:szCs w:val="22"/>
+          </w:rPr>
+          <w:delText xml:space="preserve">在自我表达里活出松弛与深刻</w:delText>
+        </w:r>
+      </w:del>
+      <w:ins w:id="11" w:author="仟传小省力" w:date="2026-07-28T17:00:31.505Z">
+        <w:r>
+          <w:rPr>
+            <w:rFonts w:ascii="Arial Unicode MS" w:cs="Arial Unicode MS" w:eastAsia="Arial Unicode MS" w:hAnsi="Arial Unicode MS"/>
+            <w:color w:val="1F4E78"/>
+            <w:sz w:val="22"/>
+            <w:szCs w:val="22"/>
+          </w:rPr>
+          <w:t xml:space="preserve">你最喜欢哪一套造型？评论区和我聊聊</w:t>
+        </w:r>
+      </w:ins>
+      <w:commentRangeEnd w:id="5"/>
+      <w:commentReference w:id="5"/>
+      <w:r>
+        <w:rPr>
+          <w:rFonts w:ascii="Arial Unicode MS" w:cs="Arial Unicode MS" w:eastAsia="Arial Unicode MS" w:hAnsi="Arial Unicode MS"/>
+          <w:sz w:val="22"/>
+          <w:szCs w:val="22"/>
+        </w:rPr>
+        <w:t xml:space="preserve">。</w:t>
+      </w:r>
       <w:commentRangeStart w:id="1"/>
+      <w:ins w:id="3" w:author="仟传小省力" w:date="2026-07-28T17:00:31.505Z">
+        <w:r>
+          <w:rPr>
+            <w:rFonts w:ascii="Arial Unicode MS" w:cs="Arial Unicode MS" w:eastAsia="Arial Unicode MS" w:hAnsi="Arial Unicode MS"/>
+            <w:color w:val="1F4E78"/>
+            <w:sz w:val="22"/>
+            <w:szCs w:val="22"/>
+          </w:rPr>
+          <w:t xml:space="preserve"> #MaxMara2026春夏 #MaxMara西装 #MaxMara非凡女性</w:t>
+        </w:r>
+      </w:ins>
       <w:commentRangeEnd w:id="1"/>
       <w:commentReference w:id="1"/>
-    </w:p>
-    <w:p>
-      <w:pPr>
-        <w:spacing w:after="120" w:line="300"/>
-      </w:pPr>
-      <w:r>
-        <w:rPr>
-          <w:rFonts w:ascii="Arial Unicode MS" w:cs="Arial Unicode MS" w:eastAsia="Arial Unicode MS" w:hAnsi="Arial Unicode MS"/>
-          <w:sz w:val="22"/>
-          <w:szCs w:val="22"/>
-        </w:rPr>
-        <w:t xml:space="preserve">时长：3min 以内</w:t>
-      </w:r>
-    </w:p>
-    <w:p>
-      <w:pPr>
-        <w:spacing w:after="120" w:line="300"/>
-      </w:pPr>
-      <w:r>
-        <w:rPr>
-          <w:rFonts w:ascii="Arial Unicode MS" w:cs="Arial Unicode MS" w:eastAsia="Arial Unicode MS" w:hAnsi="Arial Unicode MS"/>
-          <w:sz w:val="22"/>
-          <w:szCs w:val="22"/>
-        </w:rPr>
-        <w:t xml:space="preserve">合作档期：3/17</w:t>
-      </w:r>
-    </w:p>
-    <w:p>
-      <w:pPr>
-        <w:spacing w:after="120" w:line="300"/>
-      </w:pPr>
-      <w:r>
-        <w:rPr>
-          <w:rFonts w:ascii="Arial Unicode MS" w:cs="Arial Unicode MS" w:eastAsia="Arial Unicode MS" w:hAnsi="Arial Unicode MS"/>
-          <w:sz w:val="22"/>
-          <w:szCs w:val="22"/>
-        </w:rPr>
-        <w:t xml:space="preserve">标题（二选一）</w:t>
-      </w:r>
-    </w:p>
-    <w:p>
-      <w:pPr>
-        <w:spacing w:after="120" w:line="300"/>
-      </w:pPr>
-      <w:r>
-        <w:rPr>
-          <w:rFonts w:ascii="Arial Unicode MS" w:cs="Arial Unicode MS" w:eastAsia="Arial Unicode MS" w:hAnsi="Arial Unicode MS"/>
-          <w:sz w:val="22"/>
-          <w:szCs w:val="22"/>
-        </w:rPr>
-        <w:t xml:space="preserve">1. 18 世纪的浪漫，如何穿成当代通勤的锋利气场？</w:t>
-      </w:r>
-    </w:p>
-    <w:p>
-      <w:pPr>
-        <w:spacing w:after="120" w:line="300"/>
-      </w:pPr>
-      <w:r>
-        <w:rPr>
-          <w:rFonts w:ascii="Arial Unicode MS" w:cs="Arial Unicode MS" w:eastAsia="Arial Unicode MS" w:hAnsi="Arial Unicode MS"/>
-          <w:sz w:val="22"/>
-          <w:szCs w:val="22"/>
-        </w:rPr>
-        <w:t xml:space="preserve">2. Rococo Modern｜把繁复宫廷穿成当代锋芒</w:t>
-      </w:r>
-    </w:p>
-    <w:p>
-      <w:pPr>
-        <w:spacing w:after="120" w:line="300"/>
-      </w:pPr>
-      <w:r>
-        <w:rPr>
-          <w:rFonts w:ascii="Arial Unicode MS" w:cs="Arial Unicode MS" w:eastAsia="Arial Unicode MS" w:hAnsi="Arial Unicode MS"/>
-          <w:color w:val="C00000"/>
-          <w:sz w:val="22"/>
-          <w:szCs w:val="22"/>
-          <w:highlight w:val="yellow"/>
-          <w:highlightCs w:val="yellow"/>
-        </w:rPr>
-        <w:t xml:space="preserve">洛可可风起源于 18 世纪的法国，强调夸张的造型、繁复的装饰，马卡龙色彩以及自然形态的装饰。如果说这一时期的洛可可代表着繁复与奢靡，那 Max Mara 2026 春夏系列就是对它最彻底最鲜活的当代反叛——在米兰秀场上，Max Mara 以「洛可可新风（Rococo Modern）」为核，将洛可可的繁复奢靡拆解重构，让简约灵动成为优雅新解，在理性与幻想的交织里，暗涌着秩序中的叛逆。</w:t>
-      </w:r>
-      <w:commentRangeStart w:id="0"/>
-      <w:commentRangeEnd w:id="0"/>
-      <w:commentReference w:id="0"/>
-      <w:commentRangeStart w:id="2"/>
-      <w:commentRangeEnd w:id="2"/>
-      <w:commentReference w:id="2"/>
-    </w:p>
-    <w:p>
-      <w:pPr>
-        <w:spacing w:after="120" w:line="300"/>
-      </w:pPr>
-      <w:r>
-        <w:rPr>
-          <w:rFonts w:ascii="Arial Unicode MS" w:cs="Arial Unicode MS" w:eastAsia="Arial Unicode MS" w:hAnsi="Arial Unicode MS"/>
-          <w:sz w:val="22"/>
-          <w:szCs w:val="22"/>
-        </w:rPr>
-        <w:t xml:space="preserve">这季设计的巧思，藏在“洛可可元素的当代化表达”里！作为洛可可风格的标志性符号，褶皱与涡卷纹样被剥离了宫廷的甜腻感：品牌标志性的利落风衣在肩部绽开繁复褶叠花冠，修身铅笔裙侧腰浮起丰盈褶皱，全黑羽翼外套则用线条的张力，替代了传统洛可可的柔媚装饰。</w:t>
-      </w:r>
-    </w:p>
-    <w:p>
-      <w:pPr>
-        <w:spacing w:after="120" w:line="300"/>
-      </w:pPr>
-      <w:r>
-        <w:rPr>
-          <w:rFonts w:ascii="Arial Unicode MS" w:cs="Arial Unicode MS" w:eastAsia="Arial Unicode MS" w:hAnsi="Arial Unicode MS"/>
-          <w:color w:val="C00000"/>
-          <w:sz w:val="22"/>
-          <w:szCs w:val="22"/>
-          <w:highlight w:val="yellow"/>
-          <w:highlightCs w:val="yellow"/>
-        </w:rPr>
-        <w:t xml:space="preserve">而精裁西装、低腰长裤的利落廓形，又将 18 世纪的洛可可美学，稳稳收进当代职场女性的气场里。</w:t>
-      </w:r>
-      <w:commentRangeStart w:id="4"/>
-      <w:commentRangeEnd w:id="4"/>
-      <w:commentReference w:id="4"/>
-    </w:p>
-    <w:p>
-      <w:pPr>
-        <w:spacing w:after="120" w:line="300"/>
-      </w:pPr>
-      <w:r>
-        <w:rPr>
-          <w:rFonts w:ascii="Arial Unicode MS" w:cs="Arial Unicode MS" w:eastAsia="Arial Unicode MS" w:hAnsi="Arial Unicode MS"/>
-          <w:color w:val="C00000"/>
-          <w:sz w:val="22"/>
-          <w:szCs w:val="22"/>
-          <w:highlight w:val="yellow"/>
-          <w:highlightCs w:val="yellow"/>
-        </w:rPr>
-        <w:t xml:space="preserve">就像这件浅卡其收腰西装，利落斜襟自带力量感，侧扣撞色袖口点亮细节——通勤、商务场景皆能驾驭，既保留 Max Mara 标志性的女绅士风骨，又藏着极简主义的精致；还有这件花瓣肩西装，肩部褶皱如盛放花冠，直身版型平衡柔媚与干练，周末 brunch 或城市漫步时穿，刚好是“温柔里藏锋芒”的高级感；或是这套短款西装 + 半裙，利落短款拉长身材比例，收腰设计强化干练气场，小个子也能穿出独属于自己的大女主姿态！</w:t>
-      </w:r>
-      <w:commentRangeStart w:id="3"/>
-      <w:commentRangeEnd w:id="3"/>
-      <w:commentReference w:id="3"/>
-    </w:p>
-    <w:p>
-      <w:pPr>
-        <w:spacing w:after="120" w:line="300"/>
-      </w:pPr>
-      <w:r>
-        <w:rPr>
-          <w:rFonts w:ascii="Arial Unicode MS" w:cs="Arial Unicode MS" w:eastAsia="Arial Unicode MS" w:hAnsi="Arial Unicode MS"/>
-          <w:sz w:val="22"/>
-          <w:szCs w:val="22"/>
-        </w:rPr>
-        <w:t xml:space="preserve">色彩的转译，更是 Max Mara 对洛可可美学的全新诠释：传统洛可可偏爱浓艳金红的奢靡视觉，而本季雾粉、银灰、浅金等通透色调成为主角，如春日清风般轻盈透气，却依旧饱含情绪张力——这正是洛可可美学的核心奥义：美不必沉重，但必须深刻。</w:t>
-      </w:r>
-    </w:p>
-    <w:p>
-      <w:pPr>
-        <w:spacing w:after="120" w:line="300"/>
-      </w:pPr>
-      <w:r>
-        <w:rPr>
-          <w:rFonts w:ascii="Arial Unicode MS" w:cs="Arial Unicode MS" w:eastAsia="Arial Unicode MS" w:hAnsi="Arial Unicode MS"/>
-          <w:sz w:val="22"/>
-          <w:szCs w:val="22"/>
-        </w:rPr>
-        <w:t xml:space="preserve">而这一切设计的灵感源头，正是 18 世纪法国宫廷的传奇女性蓬帕杜夫人。她并非只是宫廷贵妇人，更是凭才华与智慧打破性别桎梏的先锋：以审美定义时代风格，用果敢搅动宫廷格局，将“自我表达”刻进了洛可可的灵魂。</w:t>
-      </w:r>
-    </w:p>
-    <w:p>
-      <w:pPr>
-        <w:spacing w:after="120" w:line="300"/>
-      </w:pPr>
-      <w:r>
-        <w:rPr>
-          <w:rFonts w:ascii="Arial Unicode MS" w:cs="Arial Unicode MS" w:eastAsia="Arial Unicode MS" w:hAnsi="Arial Unicode MS"/>
-          <w:sz w:val="22"/>
-          <w:szCs w:val="22"/>
-        </w:rPr>
-        <w:t xml:space="preserve">Max Mara 2026 春夏系列，正是对她这份精神的当代致敬：黑色弹力腰带收束繁复褶皱，束带式肩带简化宫廷线条，把洛可可的繁复精致作为华丽底色，用利落的设计细节诠释机动简洁的锋利态度，恰如蓬帕杜夫人凭才华站上时代中心的果敢锋芒。</w:t>
-      </w:r>
-    </w:p>
-    <w:p>
-      <w:pPr>
-        <w:spacing w:after="120" w:line="300"/>
-      </w:pPr>
-      <w:r>
-        <w:rPr>
-          <w:rFonts w:ascii="Arial Unicode MS" w:cs="Arial Unicode MS" w:eastAsia="Arial Unicode MS" w:hAnsi="Arial Unicode MS"/>
-          <w:color w:val="C00000"/>
-          <w:sz w:val="22"/>
-          <w:szCs w:val="22"/>
-          <w:highlight w:val="yellow"/>
-          <w:highlightCs w:val="yellow"/>
-        </w:rPr>
-        <w:t xml:space="preserve">作家岳本野蔷薇曾言，洛可可的根基是“究极个人主义”，像朋克摇滚般不讨好、不迎合，只专注自我——这既是 18 世纪洛可可的反叛内核，也是 Max Mara 想带给当代女性的底气：用轻盈色调藏起繁复线条，以精致设计包裹不妥协的态度，让女性在雅致中蕴生力量，在自我表达里活出松弛与深刻。</w:t>
-      </w:r>
-      <w:commentRangeStart w:id="5"/>
-      <w:commentRangeEnd w:id="5"/>
-      <w:commentReference w:id="5"/>
     </w:p>
     <w:sectPr>
       <w:pgSz w:w="12240" w:h="15840" w:orient="portrait"/>
@@ -258,7 +393,7 @@
 
 <file path=word/comments.xml><?xml version="1.0" encoding="utf-8"?>
 <w:comments xmlns:cx="http://schemas.microsoft.com/office/drawing/2014/chartex" xmlns:cx1="http://schemas.microsoft.com/office/drawing/2015/9/8/chartex" xmlns:cx2="http://schemas.microsoft.com/office/drawing/2015/10/21/chartex" xmlns:cx3="http://schemas.microsoft.com/office/drawing/2016/5/9/chartex" xmlns:cx4="http://schemas.microsoft.com/office/drawing/2016/5/10/chartex" xmlns:cx5="http://schemas.microsoft.com/office/drawing/2016/5/11/chartex" xmlns:cx6="http://schemas.microsoft.com/office/drawing/2016/5/12/chartex" xmlns:cx7="http://schemas.microsoft.com/office/drawing/2016/5/13/chartex" xmlns:cx8="http://schemas.microsoft.com/office/drawing/2016/5/14/chartex" xmlns:mc="http://schemas.openxmlformats.org/markup-compatibility/2006" xmlns:aink="http://schemas.microsoft.com/office/drawing/2016/ink" xmlns:am3d="http://schemas.microsoft.com/office/drawing/2017/model3d" xmlns:o="urn:schemas-microsoft-com:office:office" xmlns:r="http://schemas.openxmlformats.org/officeDocument/2006/relationships" xmlns:m="http://schemas.openxmlformats.org/officeDocument/2006/math" xmlns:v="urn:schemas-microsoft-com:vml" xmlns:wp14="http://schemas.microsoft.com/office/word/2010/wordprocessingDrawing" xmlns:wp="http://schemas.openxmlformats.org/drawingml/2006/wordprocessingDrawing" xmlns:w10="urn:schemas-microsoft-com:office:word" xmlns:w="http://schemas.openxmlformats.org/wordprocessingml/2006/main" xmlns:w14="http://schemas.microsoft.com/office/word/2010/wordml" xmlns:w15="http://schemas.microsoft.com/office/word/2012/wordml" xmlns:w16cex="http://schemas.microsoft.com/office/word/2018/wordml/cex" xmlns:w16cid="http://schemas.microsoft.com/office/word/2016/wordml/cid" xmlns:w16="http://schemas.microsoft.com/office/word/2018/wordml" xmlns:w16sdtdh="http://schemas.microsoft.com/office/word/2020/wordml/sdtdatahash" xmlns:w16se="http://schemas.microsoft.com/office/word/2015/wordml/symex" xmlns:wpg="http://schemas.microsoft.com/office/word/2010/wordprocessingGroup" xmlns:wpi="http://schemas.microsoft.com/office/word/2010/wordprocessingInk" xmlns:wne="http://schemas.microsoft.com/office/word/2006/wordml" xmlns:wps="http://schemas.microsoft.com/office/word/2010/wordprocessingShape">
-  <w:comment w:id="0" w:initials="仟传" w:author="仟传小省力" w:date="2026-07-15T04:32:59.177Z">
+  <w:comment w:id="0" w:initials="仟传" w:author="仟传小省力" w:date="2026-07-28T17:00:31.503Z">
     <w:p>
       <w:r>
         <w:rPr>
@@ -348,7 +483,7 @@
       </w:r>
     </w:p>
   </w:comment>
-  <w:comment w:id="1" w:initials="仟传" w:author="仟传小省力" w:date="2026-07-15T04:32:59.177Z">
+  <w:comment w:id="1" w:initials="仟传" w:author="仟传小省力" w:date="2026-07-28T17:00:31.503Z">
     <w:p>
       <w:r>
         <w:rPr>
@@ -438,7 +573,7 @@
       </w:r>
     </w:p>
   </w:comment>
-  <w:comment w:id="2" w:initials="仟传" w:author="仟传小省力" w:date="2026-07-15T04:32:59.177Z">
+  <w:comment w:id="2" w:initials="仟传" w:author="仟传小省力" w:date="2026-07-28T17:00:31.504Z">
     <w:p>
       <w:r>
         <w:rPr>
@@ -528,7 +663,7 @@
       </w:r>
     </w:p>
   </w:comment>
-  <w:comment w:id="3" w:initials="仟传" w:author="仟传小省力" w:date="2026-07-15T04:32:59.177Z">
+  <w:comment w:id="3" w:initials="仟传" w:author="仟传小省力" w:date="2026-07-28T17:00:31.504Z">
     <w:p>
       <w:r>
         <w:rPr>
@@ -618,7 +753,7 @@
       </w:r>
     </w:p>
   </w:comment>
-  <w:comment w:id="4" w:initials="仟传" w:author="仟传小省力" w:date="2026-07-15T04:32:59.177Z">
+  <w:comment w:id="4" w:initials="仟传" w:author="仟传小省力" w:date="2026-07-28T17:00:31.504Z">
     <w:p>
       <w:r>
         <w:rPr>
@@ -708,7 +843,7 @@
       </w:r>
     </w:p>
   </w:comment>
-  <w:comment w:id="5" w:initials="仟传" w:author="仟传小省力" w:date="2026-07-15T04:32:59.177Z">
+  <w:comment w:id="5" w:initials="仟传" w:author="仟传小省力" w:date="2026-07-28T17:00:31.504Z">
     <w:p>
       <w:r>
         <w:rPr>

</xml_diff>